<commit_message>
Sandy & Junior 2027: revisão da Parte 3
Co-Authored-By: Claude Opus 5.5 <noreply@anthropic.com>
Claude-Session: https://claude.ai/code/session_01MJjUEEZrxQDEUifKK2vj9g
</commit_message>
<xml_diff>
--- a/roteiros/sandy-junior-2027/SJ27_Parte3.docx
+++ b/roteiros/sandy-junior-2027/SJ27_Parte3.docx
@@ -103,7 +103,7 @@
         <w:rPr>
           <w:color w:val="000000"/>
         </w:rPr>
-        <w:t>Doze anos antes, aquelas duas vozes tinham saído de um programa de música do interior, gravadas quase por acaso numa fita. Agora dividiam a mesma noite com as maiores estrelas do pop mundial, diante de um público gigantesco. Para os dois, era o auge da carreira. Para um deles, era também o lugar onde uma raiva muito antiga ia encontrar uma saída.</w:t>
+        <w:t>Pouco mais de onze anos antes, aquelas duas vozes tinham saído de um programa de música do interior, gravadas quase por acaso numa fita. Agora dividiam a mesma noite com as maiores estrelas do pop mundial, diante de um público gigantesco. Para os dois, era o auge da carreira. Para um deles, era também o lugar onde uma raiva muito antiga ia encontrar uma saída.</w:t>
       </w:r>
     </w:p>
     <w:p>
@@ -127,7 +127,7 @@
         <w:rPr>
           <w:color w:val="C00000"/>
         </w:rPr>
-        <w:t>Guarde esse momento. Junior sozinho na percussão, diante de um mar de gente. Parece só um detalhe de show. Só que aquelas batidas tinham uma origem que ele escondeu por quase vinte anos. E, quando finalmente contou de onde elas vinham, a história da dupla nunca mais foi vista do mesmo jeito.</w:t>
+        <w:t>Guarde esse momento. Junior sozinho na percussão, diante de um mar de gente. Parece só um detalhe de show. Só que, por trás daquela vontade de mostrar que sabia tocar, havia uma história que ele escondeu por quase vinte anos. E, quando finalmente contou, a história da dupla nunca mais foi vista do mesmo jeito.</w:t>
       </w:r>
     </w:p>
     <w:p>
@@ -207,7 +207,7 @@
         <w:rPr>
           <w:color w:val="C00000"/>
         </w:rPr>
-        <w:t>E foi aí que uma fita foi parar numa gaveta da Globo. Uma cena gravada que nunca foi exibida. Até hoje, ninguém fora da emissora assistiu a ela.</w:t>
+        <w:t>E foi aí que uma fita foi parar numa gaveta da Globo. Uma cena gravada que nunca foi exibida. Até hoje, ela nunca foi ao ar.</w:t>
       </w:r>
     </w:p>
     <w:p>
@@ -279,7 +279,7 @@
         <w:rPr>
           <w:color w:val="000000"/>
         </w:rPr>
-        <w:t>Ninguém pediu à emissora que protegesse Junior de qualquer coisa. O nome dele não apareceu em nenhuma condição de contrato.</w:t>
+        <w:t>Não há registro de que alguém tenha pedido à emissora para proteger Junior de qualquer coisa. Quase ninguém olhava para ele.</w:t>
       </w:r>
     </w:p>
     <w:p>
@@ -327,7 +327,7 @@
         <w:rPr>
           <w:color w:val="000000"/>
         </w:rPr>
-        <w:t>Desde os seis anos de idade, a vida deles tinha sido organizada por gravadoras e emissoras de televisão. Discos todos os anos e turnês pelo país inteiro. Agora, pela primeira vez, os dois começavam a se perguntar o que queriam fazer quando não estivessem juntos no palco.</w:t>
+        <w:t>Desde os seis anos de idade, a vida deles tinha sido organizada por gravadoras e emissoras de televisão. Discos todos os anos e turnês pelo país inteiro. Com o fim da série, sobrava espaço para uma pergunta que nunca tinha sido feita. O que cada um queria fazer longe do outro.</w:t>
       </w:r>
     </w:p>
     <w:p>
@@ -383,7 +383,7 @@
         <w:rPr>
           <w:color w:val="1F4EB4"/>
         </w:rPr>
-        <w:t>E foi Junior, o irmão que o Brasil chamava de sombra, quem levou para os pais a decisão de acabar com a dupla.</w:t>
+        <w:t>E foi Junior, o irmão que ouvia ser chamado de sombra, quem levou para os pais a decisão de acabar com a dupla.</w:t>
       </w:r>
     </w:p>
     <w:p>
@@ -431,7 +431,7 @@
         <w:rPr>
           <w:color w:val="000000"/>
         </w:rPr>
-        <w:t>Lembra da percussão no Rock in Rio? Aquelas batidas diante de duzentas e cinquenta mil pessoas também nasceram dessa raiva.</w:t>
+        <w:t>Lembra da percussão no Rock in Rio? Agora dá para entender de onde vinha aquela vontade de mostrar, diante de duzentas e cinquenta mil pessoas, que ele sabia tocar.</w:t>
       </w:r>
     </w:p>
     <w:p>
@@ -487,7 +487,7 @@
         <w:rPr>
           <w:color w:val="C00000"/>
         </w:rPr>
-        <w:t>Só que, do outro lado daquela conversa, havia duas pessoas que tinham construído tudo aquilo com eles. E a reação delas foi muito diferente do que os filhos imaginavam.</w:t>
+        <w:t>Só que, do outro lado daquela conversa, havia duas pessoas que tinham construído tudo aquilo com eles. E a reação delas mostrou o tamanho do que aqueles dois estavam desfazendo.</w:t>
       </w:r>
     </w:p>
     <w:p>

</xml_diff>